<commit_message>
Renato Russo: revisão da Parte 5 (fitas apreendidas, conectores, afirmações sem fonte)
Co-Authored-By: Claude Opus 5.5 <noreply@anthropic.com>
Claude-Session: https://claude.ai/code/session_01MJjUEEZrxQDEUifKK2vj9g
</commit_message>
<xml_diff>
--- a/roteiros/renato-russo/Renato_Parte5.docx
+++ b/roteiros/renato-russo/Renato_Parte5.docx
@@ -79,7 +79,7 @@
         <w:rPr>
           <w:color w:val="000000"/>
         </w:rPr>
-        <w:t>E a investigação corre em sigilo.</w:t>
+        <w:t>A investigação corre em sigilo.</w:t>
       </w:r>
     </w:p>
     <w:p>
@@ -111,7 +111,7 @@
         <w:rPr>
           <w:color w:val="C00000"/>
         </w:rPr>
-        <w:t>Só que, para entender o que realmente está em jogo nessa guerra, a gente precisa voltar três anos. Para aquele dia de dezembro em que a polícia entrou num depósito da Zona Norte do Rio. Porque tudo o que você ouviu até aqui leva para dentro daquele depósito.</w:t>
+        <w:t>Para entender o que realmente está em jogo nessa guerra, a gente precisa voltar três anos. Para aquele dia de dezembro em que a polícia entrou num depósito da Zona Norte do Rio. Porque tudo o que você ouviu até aqui leva para dentro daquele depósito.</w:t>
       </w:r>
     </w:p>
     <w:p>
@@ -127,7 +127,7 @@
         <w:rPr>
           <w:color w:val="000000"/>
         </w:rPr>
-        <w:t>Segundo Giuliano, alguns anos antes, ele passou a receber mensagens de perfis falsos. Alguém falava da existência de gravações inéditas do pai dele. E, segundo ele, chegou a ameaçá-lo.</w:t>
+        <w:t>Segundo Giuliano, por volta de dois mil e dezessete, ele passou a receber mensagens de perfis falsos. Alguém falava da existência de gravações inéditas do pai dele. E, segundo ele, chegou a ameaçá-lo.</w:t>
       </w:r>
     </w:p>
     <w:p>
@@ -135,7 +135,7 @@
         <w:rPr>
           <w:color w:val="000000"/>
         </w:rPr>
-        <w:t>Anos antes, uma gravação rara tinha aparecido. Era Renato cantando com o Aborto Elétrico, a primeira banda dele, aquela dos garotos punks de Brasília.</w:t>
+        <w:t>Antes disso, uma gravação rara tinha aparecido. Era Renato cantando com o Aborto Elétrico, a primeira banda dele, aquela dos garotos punks de Brasília.</w:t>
       </w:r>
     </w:p>
     <w:p>
@@ -183,7 +183,7 @@
         <w:rPr>
           <w:color w:val="000000"/>
         </w:rPr>
-        <w:t>Mas a investigação continuou. E o relatório levava a um lugar específico.</w:t>
+        <w:t>A investigação continuou.</w:t>
       </w:r>
     </w:p>
     <w:p>
@@ -255,7 +255,7 @@
         <w:rPr>
           <w:color w:val="000000"/>
         </w:rPr>
-        <w:t>E uma versão de Faroeste Caboclo em ritmo de reggae.</w:t>
+        <w:t>Havia também uma versão de Faroeste Caboclo em ritmo de reggae.</w:t>
       </w:r>
     </w:p>
     <w:p>
@@ -271,7 +271,7 @@
         <w:rPr>
           <w:color w:val="000000"/>
         </w:rPr>
-        <w:t>Parte do que ele gravou ao longo da vida estava ali, em caixas de um depósito. Eram sobras de estúdio, versões que a banda não chegou a usar.</w:t>
+        <w:t>Parte do que ele gravou com a Legião estava ali, em caixas de um depósito. Versões que a banda não chegou a usar.</w:t>
       </w:r>
     </w:p>
     <w:p>
@@ -319,7 +319,7 @@
         <w:rPr>
           <w:color w:val="000000"/>
         </w:rPr>
-        <w:t>E, desde então, o público não ouviu nenhuma delas.</w:t>
+        <w:t>Até hoje, não há notícia de que o público tenha ouvido o que estava nelas.</w:t>
       </w:r>
     </w:p>
     <w:p>
@@ -351,7 +351,7 @@
         <w:rPr>
           <w:color w:val="000000"/>
         </w:rPr>
-        <w:t>Em março de dois mil e vinte e um, poucos meses depois da operação, a empresa de Giuliano assinou um contrato com uma produtora, a Gávea Filmes. O plano era um documentário feito só com o acervo pessoal de Renato. Mais de seis mil objetos. Entre eles, diários e cadernos escritos à mão.</w:t>
+        <w:t>No começo de dois mil e vinte e um, poucos meses depois da operação, a empresa de Giuliano assinou um contrato com uma produtora, a Gávea Filmes. O plano era um documentário feito só com o acervo pessoal de Renato. Mais de seis mil objetos. Entre eles, diários e cadernos escritos à mão.</w:t>
       </w:r>
     </w:p>
     <w:p>
@@ -423,7 +423,7 @@
         <w:rPr>
           <w:color w:val="C00000"/>
         </w:rPr>
-        <w:t>E existe uma data que torna tudo isso ainda mais doloroso. Ela está a poucos dias de distância.</w:t>
+        <w:t>Existe uma data que torna tudo isso ainda mais doloroso. Ela está a poucos dias de distância.</w:t>
       </w:r>
     </w:p>
     <w:p>
@@ -479,7 +479,7 @@
         <w:rPr>
           <w:color w:val="000000"/>
         </w:rPr>
-        <w:t>O segredo que ele escondeu, o Brasil descobriu da pior maneira, pela televisão, na mesma hora que a mãe dele.</w:t>
+        <w:t>O segredo que ele escondeu, o Brasil descobriu da pior maneira, pela televisão, no mesmo dia que a mãe dele.</w:t>
       </w:r>
     </w:p>
     <w:p>

</xml_diff>